<commit_message>
docs: record the actual deployment rather than the plan
The report said nothing had been deployed and gave a recommended sequence.
Both are now out of date: the migrations are applied and the code is live.

Replaces that with what happened, including the two findings worth keeping on
record - that 0003 and 0004 from an earlier release had never reached
production, so quotation queries had been failing before this work started;
and that 0008 failed on its first run and rolled back cleanly before being
corrected, which is the transactional design working as intended.

Carries forward the three outstanding actions: populate SEI names, replace the
two TO BE FILLED locations, and rotate the database password that was shared
over chat during deployment.

Co-Authored-By: Claude Sonnet 5 <noreply@anthropic.com>
Claude-Session: https://claude.ai/code/session_01PsE99MdydbfNkQDFpq51Cm
</commit_message>
<xml_diff>
--- a/docs/CRM-Points-Response.docx
+++ b/docs/CRM-Points-Response.docx
@@ -124,7 +124,16 @@
           <w:b w:val="0"/>
           <w:i w:val="0"/>
         </w:rPr>
-        <w:t>Two things to be clear about up front. First, nothing has been deployed: four database migrations are written, self-verifying and tested, but have not been applied to any database, including production. The deployment section explains the order they must run in and why. Second, there is an honest list of remaining limitations at the end. The most immediate one is that the SEI name list ships empty and needs an L6 to fill it in before the field does anything useful.</w:t>
+        <w:t>This work is now live in production. A full backup was taken and verified first, all database migrations were applied and self-verified, and the code was deployed. The deployment section records what happened, including one migration that failed on its first attempt and rolled back cleanly before being corrected and re-run.</w:t>
+      </w:r>
+    </w:p>
+    <w:p>
+      <w:r>
+        <w:rPr>
+          <w:b w:val="0"/>
+          <w:i w:val="0"/>
+        </w:rPr>
+        <w:t>Two things worth knowing up front. Two migrations from an earlier release, 0003 and 0004, turned out never to have been applied to production at all - which meant quotation features had been failing before any of this work started. They are applied now. And there is an honest list of remaining limitations at the end; the most immediate is that the SEI name list ships empty and needs an L6 to fill it in before the field does anything useful.</w:t>
       </w:r>
     </w:p>
     <w:p>
@@ -6711,7 +6720,7 @@
         <w:pStyle w:val="Heading2"/>
       </w:pPr>
       <w:r>
-        <w:t>Recommended deployment sequence</w:t>
+        <w:t>What actually happened during deployment</w:t>
       </w:r>
     </w:p>
     <w:p>
@@ -6720,7 +6729,7 @@
         <w:spacing w:after="60"/>
       </w:pPr>
       <w:r>
-        <w:t>Take a full manual database backup with pg_dump and confirm you can actually restore it into a scratch database. Do this first. There is no automated backup on the free plan to rely on instead.</w:t>
+        <w:t>A full backup was taken of all fourteen tables and verified: every value decoded and every row count matched the live database. Because the free plan has no automated backups, this was written with a purpose-built tool that needs nothing beyond the database driver the application already uses.</w:t>
       </w:r>
     </w:p>
     <w:p>
@@ -6729,7 +6738,7 @@
         <w:spacing w:after="60"/>
       </w:pPr>
       <w:r>
-        <w:t>Apply 0005, 0006, 0007, 0008 in that order to a staging or branch database that has real production data in it, not an empty one. The self-checks in these migrations only prove anything against real rows.</w:t>
+        <w:t>The migration tracking table did not exist, revealing that migrations 0003 and 0004 from an earlier release had never been applied to production. The column quotations.drive_file_id was missing entirely, which means every quotation query had been failing in production before this work began. Migrations 0001 and 0002 were confirmed already in place and are written to be safely repeatable, so replaying them changed nothing.</w:t>
       </w:r>
     </w:p>
     <w:p>
@@ -6738,7 +6747,7 @@
         <w:spacing w:after="60"/>
       </w:pPr>
       <w:r>
-        <w:t>Confirm on staging: existing cases show the same owners as before; no L5 or L6 appears as an account handler anywhere; customers that had no location now show TO BE FILLED; existing SEI values survived the conversion; and a customer restore from the recycle bin still works.</w:t>
+        <w:t>0001 through 0007 applied successfully. 0008 failed and rolled back cleanly: it used a form of query that PostgreSQL does not permit when changing a column's type. Because every migration runs inside its own transaction, the database was left exactly as it was rather than half-converted.</w:t>
       </w:r>
     </w:p>
     <w:p>
@@ -6747,7 +6756,7 @@
         <w:spacing w:after="60"/>
       </w:pPr>
       <w:r>
-        <w:t>Deploy the application code.</w:t>
+        <w:t>0008 was rewritten using an equivalent expression, then checked against the application's own parsing logic across eleven awkward inputs - including values with doubled separators, a separator-only string, and an empty value - before being applied. It then passed its own internal per-row verification.</w:t>
       </w:r>
     </w:p>
     <w:p>
@@ -6756,7 +6765,7 @@
         <w:spacing w:after="60"/>
       </w:pPr>
       <w:r>
-        <w:t>Apply the same four migrations to production, in the same order. Each aborts its own transaction on any mismatch, so a failure leaves the database as it was rather than half converted.</w:t>
+        <w:t>Post-migration checks confirmed: all eight migrations applied; both SEI columns converted to lists; row counts unchanged in every table; the two customers that had no location now carry TO BE FILLED; and all four cases have at least one owner.</w:t>
       </w:r>
     </w:p>
     <w:p>
@@ -6765,7 +6774,15 @@
         <w:spacing w:after="60"/>
       </w:pPr>
       <w:r>
-        <w:t>Immediately after: have an L6 populate the SEI names list under Admin &gt; Settings. Until that is done the field cannot be used.</w:t>
+        <w:t>The database password was rotated and the connection string updated in the hosting environment, then the application code was deployed.</w:t>
+      </w:r>
+    </w:p>
+    <w:p>
+      <w:pPr>
+        <w:pStyle w:val="Heading2"/>
+      </w:pPr>
+      <w:r>
+        <w:t>Still to do</w:t>
       </w:r>
     </w:p>
     <w:p>
@@ -6774,7 +6791,25 @@
         <w:spacing w:after="60"/>
       </w:pPr>
       <w:r>
-        <w:t>Then: review any customer showing TO BE FILLED as its location and give it a real one.</w:t>
+        <w:t>Have an L6 populate the SEI names list under Admin &gt; Settings. Until that is done the field cannot be used.</w:t>
+      </w:r>
+    </w:p>
+    <w:p>
+      <w:pPr>
+        <w:pStyle w:val="ListNumber"/>
+        <w:spacing w:after="60"/>
+      </w:pPr>
+      <w:r>
+        <w:t>Review the two customers showing TO BE FILLED as their location and give them a real one.</w:t>
+      </w:r>
+    </w:p>
+    <w:p>
+      <w:pPr>
+        <w:pStyle w:val="ListNumber"/>
+        <w:spacing w:after="60"/>
+      </w:pPr>
+      <w:r>
+        <w:t>Rotate the database password again at a convenient point, since it was shared over chat during deployment, and update it in the hosting environment at the same time.</w:t>
       </w:r>
     </w:p>
     <w:p>

</xml_diff>